<commit_message>
Lunch handout: Reflect and Repair table
</commit_message>
<xml_diff>
--- a/resources/systems/procedures/schoolwide/handouts/lunch-student-handout.docx
+++ b/resources/systems/procedures/schoolwide/handouts/lunch-student-handout.docx
@@ -356,27 +356,25 @@
           <w:sz w:val="21"/>
           <w:szCs w:val="21"/>
         </w:rPr>
-        <w:t xml:space="preserve">8.  </w:t>
-      </w:r>
-      <w:r>
-        <w:rPr>
-          <w:rFonts w:ascii="Calibri" w:cs="Calibri" w:eastAsia="Calibri" w:hAnsi="Calibri"/>
-          <w:b/>
-          <w:bCs/>
-          <w:color w:val="1a1a1a"/>
-          <w:sz w:val="21"/>
-          <w:szCs w:val="21"/>
-        </w:rPr>
-        <w:t xml:space="preserve">Need a reset? </w:t>
-      </w:r>
-      <w:r>
-        <w:rPr>
-          <w:rFonts w:ascii="Calibri" w:cs="Calibri" w:eastAsia="Calibri" w:hAnsi="Calibri"/>
-          <w:color w:val="1a1a1a"/>
-          <w:sz w:val="21"/>
-          <w:szCs w:val="21"/>
-        </w:rPr>
-        <w:t xml:space="preserve">I go to the Reflection Table: pause, reflect, review, repair and return. My place here doesn't go anywhere.</w:t>
+        <w:t>8.  Need a reset? I go to the Reflect and Repair table. I keep eating, write about what happened, and do the repair I pick. My place here doesn't go anywhere.</w:t>
+      </w:r>
+      <w:r>
+        <w:rPr>
+          <w:rFonts w:ascii="Calibri" w:cs="Calibri" w:eastAsia="Calibri" w:hAnsi="Calibri"/>
+          <w:b/>
+          <w:bCs/>
+          <w:color w:val="1a1a1a"/>
+          <w:sz w:val="21"/>
+          <w:szCs w:val="21"/>
+        </w:rPr>
+      </w:r>
+      <w:r>
+        <w:rPr>
+          <w:rFonts w:ascii="Calibri" w:cs="Calibri" w:eastAsia="Calibri" w:hAnsi="Calibri"/>
+          <w:color w:val="1a1a1a"/>
+          <w:sz w:val="21"/>
+          <w:szCs w:val="21"/>
+        </w:rPr>
       </w:r>
     </w:p>
     <w:p>

</xml_diff>

<commit_message>
Lunch handout: Level 2 table voice
</commit_message>
<xml_diff>
--- a/resources/systems/procedures/schoolwide/handouts/lunch-student-handout.docx
+++ b/resources/systems/procedures/schoolwide/handouts/lunch-student-handout.docx
@@ -208,27 +208,25 @@
           <w:sz w:val="21"/>
           <w:szCs w:val="21"/>
         </w:rPr>
-        <w:t xml:space="preserve">4.  </w:t>
-      </w:r>
-      <w:r>
-        <w:rPr>
-          <w:rFonts w:ascii="Calibri" w:cs="Calibri" w:eastAsia="Calibri" w:hAnsi="Calibri"/>
-          <w:b/>
-          <w:bCs/>
-          <w:color w:val="1a1a1a"/>
-          <w:sz w:val="21"/>
-          <w:szCs w:val="21"/>
-        </w:rPr>
-        <w:t xml:space="preserve">Eat. </w:t>
-      </w:r>
-      <w:r>
-        <w:rPr>
-          <w:rFonts w:ascii="Calibri" w:cs="Calibri" w:eastAsia="Calibri" w:hAnsi="Calibri"/>
-          <w:color w:val="1a1a1a"/>
-          <w:sz w:val="21"/>
-          <w:szCs w:val="21"/>
-        </w:rPr>
-        <w:t xml:space="preserve">I use the voice level the MC calls on the screen. Level 3 (table voice) is the loudest in the cafeteria.</w:t>
+        <w:t>4.  Eat. I use the voice level the MC calls on the screen. Level 2 (table voice) is the loudest in the cafeteria.</w:t>
+      </w:r>
+      <w:r>
+        <w:rPr>
+          <w:rFonts w:ascii="Calibri" w:cs="Calibri" w:eastAsia="Calibri" w:hAnsi="Calibri"/>
+          <w:b/>
+          <w:bCs/>
+          <w:color w:val="1a1a1a"/>
+          <w:sz w:val="21"/>
+          <w:szCs w:val="21"/>
+        </w:rPr>
+      </w:r>
+      <w:r>
+        <w:rPr>
+          <w:rFonts w:ascii="Calibri" w:cs="Calibri" w:eastAsia="Calibri" w:hAnsi="Calibri"/>
+          <w:color w:val="1a1a1a"/>
+          <w:sz w:val="21"/>
+          <w:szCs w:val="21"/>
+        </w:rPr>
       </w:r>
     </w:p>
     <w:p>

</xml_diff>